<commit_message>
docs: fill in the lab report cover page
Cover-page placeholders replaced with the student's actual details:

- Student Name: Saugat Bikram Thapa
- Roll No.: 80117731
- Course: BSc.CSIT
- Subject: Software Engineering  (new row - the rubric asks for the
  subject, and the table had no field for it)
- Instructor: Saroja Bhandari
- Submission Date: left blank on purpose, to be filled at submission

Also updated the file header comment, which still instructed the reader
to "replace the angle-bracket placeholders".

LAB_REPORT.docx regenerated and verified: all five details are present in
word/document.xml, and the three remaining "«include»" occurrences are
legitimate UML use-case notation rather than unfilled placeholders.

Co-Authored-By: Claude Opus 4.8 <noreply@anthropic.com>
</commit_message>
<xml_diff>
--- a/docs/LAB_REPORT.docx
+++ b/docs/LAB_REPORT.docx
@@ -145,7 +145,7 @@
             </w:pPr>
             <w:r>
               <w:rPr/>
-              <w:t xml:space="preserve">«Student Name»</w:t>
+              <w:t xml:space="preserve">Saugat Bikram Thapa</w:t>
             </w:r>
           </w:p>
         </w:tc>
@@ -176,7 +176,7 @@
             </w:pPr>
             <w:r>
               <w:rPr/>
-              <w:t xml:space="preserve">«Roll No»</w:t>
+              <w:t xml:space="preserve">80117731</w:t>
             </w:r>
           </w:p>
         </w:tc>
@@ -207,7 +207,7 @@
             </w:pPr>
             <w:r>
               <w:rPr/>
-              <w:t xml:space="preserve">«Course»</w:t>
+              <w:t xml:space="preserve">BSc.CSIT</w:t>
             </w:r>
           </w:p>
         </w:tc>
@@ -226,19 +226,19 @@
               <w:rPr>
                 <w:b/>
               </w:rPr>
-              <w:t xml:space="preserve">Instructor</w:t>
-            </w:r>
-          </w:p>
-        </w:tc>
-        <w:tc>
-          <w:tcPr/>
-          <w:p>
-            <w:pPr>
-              <w:spacing w:lineRule="auto"/>
-            </w:pPr>
-            <w:r>
-              <w:rPr/>
-              <w:t xml:space="preserve">«Instructor»</w:t>
+              <w:t xml:space="preserve">Subject</w:t>
+            </w:r>
+          </w:p>
+        </w:tc>
+        <w:tc>
+          <w:tcPr/>
+          <w:p>
+            <w:pPr>
+              <w:spacing w:lineRule="auto"/>
+            </w:pPr>
+            <w:r>
+              <w:rPr/>
+              <w:t xml:space="preserve">Software Engineering</w:t>
             </w:r>
           </w:p>
         </w:tc>
@@ -257,21 +257,44 @@
               <w:rPr>
                 <w:b/>
               </w:rPr>
+              <w:t xml:space="preserve">Instructor</w:t>
+            </w:r>
+          </w:p>
+        </w:tc>
+        <w:tc>
+          <w:tcPr/>
+          <w:p>
+            <w:pPr>
+              <w:spacing w:lineRule="auto"/>
+            </w:pPr>
+            <w:r>
+              <w:rPr/>
+              <w:t xml:space="preserve">Saroja Bhandari</w:t>
+            </w:r>
+          </w:p>
+        </w:tc>
+      </w:tr>
+      <w:tr>
+        <w:trPr>
+          <w:cantSplit/>
+        </w:trPr>
+        <w:tc>
+          <w:tcPr/>
+          <w:p>
+            <w:pPr>
+              <w:spacing w:lineRule="auto"/>
+            </w:pPr>
+            <w:r>
+              <w:rPr>
+                <w:b/>
+              </w:rPr>
               <w:t xml:space="preserve">Submission Date</w:t>
             </w:r>
           </w:p>
         </w:tc>
         <w:tc>
           <w:tcPr/>
-          <w:p>
-            <w:pPr>
-              <w:spacing w:lineRule="auto"/>
-            </w:pPr>
-            <w:r>
-              <w:rPr/>
-              <w:t xml:space="preserve">«Date»</w:t>
-            </w:r>
-          </w:p>
+          <w:p/>
         </w:tc>
       </w:tr>
       <w:tr>
@@ -4009,12 +4032,12 @@
           <wp:inline distB="0" distL="0" distR="0" distT="0">
             <wp:extent cx="5905500" cy="533400"/>
             <wp:effectExtent b="0" l="0" r="0" t="0"/>
-            <wp:docPr id="1" name="image-gSGCGzpi7rqXYGYSJQPfe.png"/>
+            <wp:docPr id="1" name="image-S8qD_2oEmakKJ7rozR4kP.png"/>
             <a:graphic>
               <a:graphicData uri="http://schemas.openxmlformats.org/drawingml/2006/picture">
                 <pic:pic>
                   <pic:nvPicPr>
-                    <pic:cNvPr id="1" name="image-gSGCGzpi7rqXYGYSJQPfe.png" descr=""/>
+                    <pic:cNvPr id="1" name="image-S8qD_2oEmakKJ7rozR4kP.png" descr=""/>
                     <pic:cNvPicPr/>
                   </pic:nvPicPr>
                   <pic:blipFill>
@@ -4095,12 +4118,12 @@
           <wp:inline distB="0" distL="0" distR="0" distT="0">
             <wp:extent cx="5905500" cy="2971800"/>
             <wp:effectExtent b="0" l="0" r="0" t="0"/>
-            <wp:docPr id="2" name="image-ibfnA052S2sksEr8UKzeB.png"/>
+            <wp:docPr id="2" name="image-OHUFkaunQo9qx3tQX0Nmj.png"/>
             <a:graphic>
               <a:graphicData uri="http://schemas.openxmlformats.org/drawingml/2006/picture">
                 <pic:pic>
                   <pic:nvPicPr>
-                    <pic:cNvPr id="2" name="image-ibfnA052S2sksEr8UKzeB.png" descr=""/>
+                    <pic:cNvPr id="2" name="image-OHUFkaunQo9qx3tQX0Nmj.png" descr=""/>
                     <pic:cNvPicPr/>
                   </pic:nvPicPr>
                   <pic:blipFill>
@@ -4165,12 +4188,12 @@
           <wp:inline distB="0" distL="0" distR="0" distT="0">
             <wp:extent cx="5905500" cy="2752725"/>
             <wp:effectExtent b="0" l="0" r="0" t="0"/>
-            <wp:docPr id="3" name="image-C1M2cDNeqvu0vdTG17gKN.png"/>
+            <wp:docPr id="3" name="image-NPN4TGO7wS66dogqoJPFG.png"/>
             <a:graphic>
               <a:graphicData uri="http://schemas.openxmlformats.org/drawingml/2006/picture">
                 <pic:pic>
                   <pic:nvPicPr>
-                    <pic:cNvPr id="3" name="image-C1M2cDNeqvu0vdTG17gKN.png" descr=""/>
+                    <pic:cNvPr id="3" name="image-NPN4TGO7wS66dogqoJPFG.png" descr=""/>
                     <pic:cNvPicPr/>
                   </pic:nvPicPr>
                   <pic:blipFill>
@@ -7296,12 +7319,12 @@
           <wp:inline distB="0" distL="0" distR="0" distT="0">
             <wp:extent cx="6096000" cy="3810000"/>
             <wp:effectExtent b="0" l="0" r="0" t="0"/>
-            <wp:docPr id="5" name="image-nHgQNosuHGqLtuEfYyYda.png"/>
+            <wp:docPr id="5" name="image-KXoZV3XmqrhdFRrTyzBrB.png"/>
             <a:graphic>
               <a:graphicData uri="http://schemas.openxmlformats.org/drawingml/2006/picture">
                 <pic:pic>
                   <pic:nvPicPr>
-                    <pic:cNvPr id="5" name="image-nHgQNosuHGqLtuEfYyYda.png" descr=""/>
+                    <pic:cNvPr id="5" name="image-KXoZV3XmqrhdFRrTyzBrB.png" descr=""/>
                     <pic:cNvPicPr/>
                   </pic:nvPicPr>
                   <pic:blipFill>
@@ -7346,12 +7369,12 @@
           <wp:inline distB="0" distL="0" distR="0" distT="0">
             <wp:extent cx="6096000" cy="3810000"/>
             <wp:effectExtent b="0" l="0" r="0" t="0"/>
-            <wp:docPr id="7" name="image-Zq-tvvPUsjlxS00uNc87u.png"/>
+            <wp:docPr id="7" name="image-f-NrFPjeSlDaZtRsSIl-e.png"/>
             <a:graphic>
               <a:graphicData uri="http://schemas.openxmlformats.org/drawingml/2006/picture">
                 <pic:pic>
                   <pic:nvPicPr>
-                    <pic:cNvPr id="7" name="image-Zq-tvvPUsjlxS00uNc87u.png" descr=""/>
+                    <pic:cNvPr id="7" name="image-f-NrFPjeSlDaZtRsSIl-e.png" descr=""/>
                     <pic:cNvPicPr/>
                   </pic:nvPicPr>
                   <pic:blipFill>
@@ -7396,12 +7419,12 @@
           <wp:inline distB="0" distL="0" distR="0" distT="0">
             <wp:extent cx="6096000" cy="3810000"/>
             <wp:effectExtent b="0" l="0" r="0" t="0"/>
-            <wp:docPr id="9" name="image-3wC1BZkdi1WQ6ygKxCVHD.png"/>
+            <wp:docPr id="9" name="image-snpeZPE1l_h7cXpZKSpI1.png"/>
             <a:graphic>
               <a:graphicData uri="http://schemas.openxmlformats.org/drawingml/2006/picture">
                 <pic:pic>
                   <pic:nvPicPr>
-                    <pic:cNvPr id="9" name="image-3wC1BZkdi1WQ6ygKxCVHD.png" descr=""/>
+                    <pic:cNvPr id="9" name="image-snpeZPE1l_h7cXpZKSpI1.png" descr=""/>
                     <pic:cNvPicPr/>
                   </pic:nvPicPr>
                   <pic:blipFill>
@@ -7446,12 +7469,12 @@
           <wp:inline distB="0" distL="0" distR="0" distT="0">
             <wp:extent cx="6096000" cy="3810000"/>
             <wp:effectExtent b="0" l="0" r="0" t="0"/>
-            <wp:docPr id="11" name="image-LPRDSKO1qwlq2aYLafMdN.png"/>
+            <wp:docPr id="11" name="image-bjs2IjI0Rs_ZSER0HnQIN.png"/>
             <a:graphic>
               <a:graphicData uri="http://schemas.openxmlformats.org/drawingml/2006/picture">
                 <pic:pic>
                   <pic:nvPicPr>
-                    <pic:cNvPr id="11" name="image-LPRDSKO1qwlq2aYLafMdN.png" descr=""/>
+                    <pic:cNvPr id="11" name="image-bjs2IjI0Rs_ZSER0HnQIN.png" descr=""/>
                     <pic:cNvPicPr/>
                   </pic:nvPicPr>
                   <pic:blipFill>
@@ -7496,12 +7519,12 @@
           <wp:inline distB="0" distL="0" distR="0" distT="0">
             <wp:extent cx="6096000" cy="3810000"/>
             <wp:effectExtent b="0" l="0" r="0" t="0"/>
-            <wp:docPr id="13" name="image-3hXjAjVWr4O13uw5FX3le.png"/>
+            <wp:docPr id="13" name="image-1joe2HLPli9pzIrfMx5-o.png"/>
             <a:graphic>
               <a:graphicData uri="http://schemas.openxmlformats.org/drawingml/2006/picture">
                 <pic:pic>
                   <pic:nvPicPr>
-                    <pic:cNvPr id="13" name="image-3hXjAjVWr4O13uw5FX3le.png" descr=""/>
+                    <pic:cNvPr id="13" name="image-1joe2HLPli9pzIrfMx5-o.png" descr=""/>
                     <pic:cNvPicPr/>
                   </pic:nvPicPr>
                   <pic:blipFill>
@@ -7546,12 +7569,12 @@
           <wp:inline distB="0" distL="0" distR="0" distT="0">
             <wp:extent cx="6096000" cy="3810000"/>
             <wp:effectExtent b="0" l="0" r="0" t="0"/>
-            <wp:docPr id="15" name="image-FCd1mUm4ltbo_PJ-8apXf.png"/>
+            <wp:docPr id="15" name="image-RKii8P6ynqdp2hrNRhUD2.png"/>
             <a:graphic>
               <a:graphicData uri="http://schemas.openxmlformats.org/drawingml/2006/picture">
                 <pic:pic>
                   <pic:nvPicPr>
-                    <pic:cNvPr id="15" name="image-FCd1mUm4ltbo_PJ-8apXf.png" descr=""/>
+                    <pic:cNvPr id="15" name="image-RKii8P6ynqdp2hrNRhUD2.png" descr=""/>
                     <pic:cNvPicPr/>
                   </pic:nvPicPr>
                   <pic:blipFill>
@@ -7596,12 +7619,12 @@
           <wp:inline distB="0" distL="0" distR="0" distT="0">
             <wp:extent cx="6096000" cy="3810000"/>
             <wp:effectExtent b="0" l="0" r="0" t="0"/>
-            <wp:docPr id="17" name="image-ilIJidCMHQwY3znVuY9-W.png"/>
+            <wp:docPr id="17" name="image-TpENs_dsqJZIkWmUFiarH.png"/>
             <a:graphic>
               <a:graphicData uri="http://schemas.openxmlformats.org/drawingml/2006/picture">
                 <pic:pic>
                   <pic:nvPicPr>
-                    <pic:cNvPr id="17" name="image-ilIJidCMHQwY3znVuY9-W.png" descr=""/>
+                    <pic:cNvPr id="17" name="image-TpENs_dsqJZIkWmUFiarH.png" descr=""/>
                     <pic:cNvPicPr/>
                   </pic:nvPicPr>
                   <pic:blipFill>
@@ -7646,12 +7669,12 @@
           <wp:inline distB="0" distL="0" distR="0" distT="0">
             <wp:extent cx="6096000" cy="3800475"/>
             <wp:effectExtent b="0" l="0" r="0" t="0"/>
-            <wp:docPr id="19" name="image-CQtab_bb0t8axm0MUUAWz.png"/>
+            <wp:docPr id="19" name="image-8yHH1GrOO-zOtrjkWZWh0.png"/>
             <a:graphic>
               <a:graphicData uri="http://schemas.openxmlformats.org/drawingml/2006/picture">
                 <pic:pic>
                   <pic:nvPicPr>
-                    <pic:cNvPr id="19" name="image-CQtab_bb0t8axm0MUUAWz.png" descr=""/>
+                    <pic:cNvPr id="19" name="image-8yHH1GrOO-zOtrjkWZWh0.png" descr=""/>
                     <pic:cNvPicPr/>
                   </pic:nvPicPr>
                   <pic:blipFill>
@@ -7696,12 +7719,12 @@
           <wp:inline distB="0" distL="0" distR="0" distT="0">
             <wp:extent cx="6096000" cy="3810000"/>
             <wp:effectExtent b="0" l="0" r="0" t="0"/>
-            <wp:docPr id="21" name="image-lKTFJXmKOCl8oJBYaAp4n.png"/>
+            <wp:docPr id="21" name="image-dZm3rU6dE4rin4xgnAPn6.png"/>
             <a:graphic>
               <a:graphicData uri="http://schemas.openxmlformats.org/drawingml/2006/picture">
                 <pic:pic>
                   <pic:nvPicPr>
-                    <pic:cNvPr id="21" name="image-lKTFJXmKOCl8oJBYaAp4n.png" descr=""/>
+                    <pic:cNvPr id="21" name="image-dZm3rU6dE4rin4xgnAPn6.png" descr=""/>
                     <pic:cNvPicPr/>
                   </pic:nvPicPr>
                   <pic:blipFill>
@@ -7746,12 +7769,12 @@
           <wp:inline distB="0" distL="0" distR="0" distT="0">
             <wp:extent cx="6096000" cy="3810000"/>
             <wp:effectExtent b="0" l="0" r="0" t="0"/>
-            <wp:docPr id="23" name="image-3C9RFEy1yhE_dSX9ZaUp9.png"/>
+            <wp:docPr id="23" name="image-aANwn0is5WiuuPF5NHkRy.png"/>
             <a:graphic>
               <a:graphicData uri="http://schemas.openxmlformats.org/drawingml/2006/picture">
                 <pic:pic>
                   <pic:nvPicPr>
-                    <pic:cNvPr id="23" name="image-3C9RFEy1yhE_dSX9ZaUp9.png" descr=""/>
+                    <pic:cNvPr id="23" name="image-aANwn0is5WiuuPF5NHkRy.png" descr=""/>
                     <pic:cNvPicPr/>
                   </pic:nvPicPr>
                   <pic:blipFill>
@@ -7796,12 +7819,12 @@
           <wp:inline distB="0" distL="0" distR="0" distT="0">
             <wp:extent cx="6096000" cy="3962400"/>
             <wp:effectExtent b="0" l="0" r="0" t="0"/>
-            <wp:docPr id="25" name="image-i6RV58pjndLuTZY2KUjgs.png"/>
+            <wp:docPr id="25" name="image-rng836phQITSNHbWEup3Y.png"/>
             <a:graphic>
               <a:graphicData uri="http://schemas.openxmlformats.org/drawingml/2006/picture">
                 <pic:pic>
                   <pic:nvPicPr>
-                    <pic:cNvPr id="25" name="image-i6RV58pjndLuTZY2KUjgs.png" descr=""/>
+                    <pic:cNvPr id="25" name="image-rng836phQITSNHbWEup3Y.png" descr=""/>
                     <pic:cNvPicPr/>
                   </pic:nvPicPr>
                   <pic:blipFill>

</xml_diff>